<commit_message>
Improve sample data and project documentation
</commit_message>
<xml_diff>
--- a/Docs/软件配置与使用说明.docx
+++ b/Docs/软件配置与使用说明.docx
@@ -534,7 +534,67 @@
         <w:rPr>
           <w:rStyle w:val="NormalTok"/>
         </w:rPr>
-        <w:t xml:space="preserve"> SecondClassroomManager</w:t>
+        <w:t xml:space="preserve"> D:</w:t>
+      </w:r>
+      <w:r>
+        <w:rPr>
+          <w:rStyle w:val="DataTypeTok"/>
+        </w:rPr>
+        <w:t xml:space="preserve">\D</w:t>
+      </w:r>
+      <w:r>
+        <w:rPr>
+          <w:rStyle w:val="NormalTok"/>
+        </w:rPr>
+        <w:t xml:space="preserve">ocument</w:t>
+      </w:r>
+      <w:r>
+        <w:rPr>
+          <w:rStyle w:val="DataTypeTok"/>
+        </w:rPr>
+        <w:t xml:space="preserve">\C</w:t>
+      </w:r>
+      <w:r>
+        <w:rPr>
+          <w:rStyle w:val="NormalTok"/>
+        </w:rPr>
+        <w:t xml:space="preserve">ourse</w:t>
+      </w:r>
+      <w:r>
+        <w:rPr>
+          <w:rStyle w:val="DataTypeTok"/>
+        </w:rPr>
+        <w:t xml:space="preserve">\C</w:t>
+      </w:r>
+      <w:r>
+        <w:rPr>
+          <w:rStyle w:val="NormalTok"/>
+        </w:rPr>
+        <w:t xml:space="preserve">#</w:t>
+      </w:r>
+      <w:r>
+        <w:rPr>
+          <w:rStyle w:val="DataTypeTok"/>
+        </w:rPr>
+        <w:t xml:space="preserve">\大</w:t>
+      </w:r>
+      <w:r>
+        <w:rPr>
+          <w:rStyle w:val="NormalTok"/>
+        </w:rPr>
+        <w:t xml:space="preserve">作业</w:t>
+      </w:r>
+      <w:r>
+        <w:rPr>
+          <w:rStyle w:val="DataTypeTok"/>
+        </w:rPr>
+        <w:t xml:space="preserve">\S</w:t>
+      </w:r>
+      <w:r>
+        <w:rPr>
+          <w:rStyle w:val="NormalTok"/>
+        </w:rPr>
+        <w:t xml:space="preserve">econdClassroomManager </w:t>
       </w:r>
     </w:p>
     <w:p>

</xml_diff>